<commit_message>
feat: add blog support for portfolio
</commit_message>
<xml_diff>
--- a/public/resume/Ali_Bayramli_Resume.docx
+++ b/public/resume/Ali_Bayramli_Resume.docx
@@ -158,7 +158,7 @@
               </w:rPr>
               <w:t xml:space="preserve"> </w:t>
             </w:r>
-            <w:hyperlink w:history="1" r:id="rIdg_k8__-y8zcti9f5vhf57">
+            <w:hyperlink w:history="1" r:id="rIdxgdgizqap6iblxkm6mqaj">
               <w:r>
                 <w:rPr>
                   <w:rFonts w:ascii="Verdana" w:cs="Verdana" w:eastAsia="Verdana" w:hAnsi="Verdana"/>
@@ -221,7 +221,7 @@
               </w:rPr>
               <w:t xml:space="preserve"> </w:t>
             </w:r>
-            <w:hyperlink w:history="1" r:id="rIdtxefem9nlgdhsag6souwf">
+            <w:hyperlink w:history="1" r:id="rIdbtiue0r_jo1ovtctvqgrh">
               <w:r>
                 <w:rPr>
                   <w:rFonts w:ascii="Verdana" w:cs="Verdana" w:eastAsia="Verdana" w:hAnsi="Verdana"/>
@@ -266,7 +266,7 @@
                 <w:szCs w:val="22"/>
               </w:rPr>
             </w:pPr>
-            <w:hyperlink w:history="1" r:id="rIddg4fljysrof92f2ox64kq">
+            <w:hyperlink w:history="1" r:id="rIdlkowbiiczdkvspspwcmop">
               <w:r>
                 <w:rPr>
                   <w:rFonts w:ascii="Verdana" w:cs="Verdana" w:eastAsia="Verdana" w:hAnsi="Verdana"/>
@@ -309,7 +309,7 @@
                 <w:szCs w:val="22"/>
               </w:rPr>
             </w:pPr>
-            <w:hyperlink w:history="1" r:id="rIdknr5dnocdxjb4onw94dw3">
+            <w:hyperlink w:history="1" r:id="rId3wxrixdlhozttaxak0w9y">
               <w:r>
                 <w:rPr>
                   <w:rFonts w:ascii="Verdana" w:cs="Verdana" w:eastAsia="Verdana" w:hAnsi="Verdana"/>
@@ -352,7 +352,7 @@
                 <w:szCs w:val="22"/>
               </w:rPr>
             </w:pPr>
-            <w:hyperlink w:history="1" r:id="rIdssb3mod2t15ngmrrghiz9">
+            <w:hyperlink w:history="1" r:id="rIdhh7xn8wcuoux8mtqxm9zo">
               <w:r>
                 <w:rPr>
                   <w:rFonts w:ascii="Verdana" w:cs="Verdana" w:eastAsia="Verdana" w:hAnsi="Verdana"/>
@@ -942,7 +942,7 @@
           <w:sz w:val="24"/>
           <w:szCs w:val="24"/>
         </w:rPr>
-        <w:t xml:space="preserve">Platform DevOps Lab</w:t>
+        <w:t xml:space="preserve">FX Notifier</w:t>
       </w:r>
     </w:p>
     <w:p>
@@ -963,7 +963,7 @@
           <w:sz w:val="22"/>
           <w:szCs w:val="22"/>
         </w:rPr>
-        <w:t xml:space="preserve">Production-shaped full-stack lab covering React, Node.js, PostgreSQL, observability, local tooling, and Kubernetes starter workflows.</w:t>
+        <w:t xml:space="preserve">Python automation for weekday Telegram FX updates with validation, derived rates, and scheduling.</w:t>
       </w:r>
       <w:r>
         <w:rPr>
@@ -986,86 +986,7 @@
         </w:rPr>
         <w:t xml:space="preserve">GitHub: </w:t>
       </w:r>
-      <w:hyperlink w:history="1" r:id="rIddudutovbpqlrtc3te9pfr">
-        <w:r>
-          <w:rPr>
-            <w:rFonts w:ascii="Verdana" w:cs="Verdana" w:eastAsia="Verdana" w:hAnsi="Verdana"/>
-            <w:noProof/>
-            <w:color w:val="111111"/>
-            <w:sz w:val="22"/>
-            <w:szCs w:val="22"/>
-            <w:u w:val="single" w:color="111111"/>
-          </w:rPr>
-          <w:t xml:space="preserve">alibayramli/platform-devops-lab</w:t>
-        </w:r>
-      </w:hyperlink>
-    </w:p>
-    <w:p>
-      <w:pPr>
-        <w:keepNext/>
-        <w:spacing w:after="0" w:line="220"/>
-        <w:rPr>
-          <w:rFonts w:ascii="Verdana" w:cs="Verdana" w:eastAsia="Verdana" w:hAnsi="Verdana"/>
-          <w:color w:val="111111"/>
-          <w:sz w:val="22"/>
-          <w:szCs w:val="22"/>
-        </w:rPr>
-      </w:pPr>
-      <w:r>
-        <w:rPr>
-          <w:rFonts w:ascii="Verdana" w:cs="Verdana" w:eastAsia="Verdana" w:hAnsi="Verdana"/>
-          <w:b/>
-          <w:bCs/>
-          <w:noProof/>
-          <w:color w:val="111111"/>
-          <w:sz w:val="24"/>
-          <w:szCs w:val="24"/>
-        </w:rPr>
-        <w:t xml:space="preserve">FX Notifier</w:t>
-      </w:r>
-    </w:p>
-    <w:p>
-      <w:pPr>
-        <w:spacing w:after="125" w:before="0" w:line="220"/>
-        <w:rPr>
-          <w:rFonts w:ascii="Verdana" w:cs="Verdana" w:eastAsia="Verdana" w:hAnsi="Verdana"/>
-          <w:color w:val="111111"/>
-          <w:sz w:val="22"/>
-          <w:szCs w:val="22"/>
-        </w:rPr>
-      </w:pPr>
-      <w:r>
-        <w:rPr>
-          <w:rFonts w:ascii="Verdana" w:cs="Verdana" w:eastAsia="Verdana" w:hAnsi="Verdana"/>
-          <w:noProof/>
-          <w:color w:val="111111"/>
-          <w:sz w:val="22"/>
-          <w:szCs w:val="22"/>
-        </w:rPr>
-        <w:t xml:space="preserve">Python automation for weekday Telegram FX updates with validation, derived rates, and scheduling.</w:t>
-      </w:r>
-      <w:r>
-        <w:rPr>
-          <w:rFonts w:ascii="Verdana" w:cs="Verdana" w:eastAsia="Verdana" w:hAnsi="Verdana"/>
-          <w:noProof/>
-          <w:color w:val="111111"/>
-          <w:sz w:val="22"/>
-          <w:szCs w:val="22"/>
-        </w:rPr>
-        <w:br/>
-        <w:t xml:space="preserve"/>
-      </w:r>
-      <w:r>
-        <w:rPr>
-          <w:rFonts w:ascii="Verdana" w:cs="Verdana" w:eastAsia="Verdana" w:hAnsi="Verdana"/>
-          <w:noProof/>
-          <w:color w:val="111111"/>
-          <w:sz w:val="22"/>
-          <w:szCs w:val="22"/>
-        </w:rPr>
-        <w:t xml:space="preserve">GitHub: </w:t>
-      </w:r>
-      <w:hyperlink w:history="1" r:id="rIdvzdq1sztbgmqajnnsm0bg">
+      <w:hyperlink w:history="1" r:id="rIdvcor7sbcldk6k9ibw736p">
         <w:r>
           <w:rPr>
             <w:rFonts w:ascii="Verdana" w:cs="Verdana" w:eastAsia="Verdana" w:hAnsi="Verdana"/>
@@ -1076,6 +997,85 @@
             <w:u w:val="single" w:color="111111"/>
           </w:rPr>
           <w:t xml:space="preserve">alibayramli/fx-notifier</w:t>
+        </w:r>
+      </w:hyperlink>
+    </w:p>
+    <w:p>
+      <w:pPr>
+        <w:keepNext/>
+        <w:spacing w:after="0" w:line="220"/>
+        <w:rPr>
+          <w:rFonts w:ascii="Verdana" w:cs="Verdana" w:eastAsia="Verdana" w:hAnsi="Verdana"/>
+          <w:color w:val="111111"/>
+          <w:sz w:val="22"/>
+          <w:szCs w:val="22"/>
+        </w:rPr>
+      </w:pPr>
+      <w:r>
+        <w:rPr>
+          <w:rFonts w:ascii="Verdana" w:cs="Verdana" w:eastAsia="Verdana" w:hAnsi="Verdana"/>
+          <w:b/>
+          <w:bCs/>
+          <w:noProof/>
+          <w:color w:val="111111"/>
+          <w:sz w:val="24"/>
+          <w:szCs w:val="24"/>
+        </w:rPr>
+        <w:t xml:space="preserve">Portfolio &amp; Blog Platform</w:t>
+      </w:r>
+    </w:p>
+    <w:p>
+      <w:pPr>
+        <w:spacing w:after="125" w:before="0" w:line="220"/>
+        <w:rPr>
+          <w:rFonts w:ascii="Verdana" w:cs="Verdana" w:eastAsia="Verdana" w:hAnsi="Verdana"/>
+          <w:color w:val="111111"/>
+          <w:sz w:val="22"/>
+          <w:szCs w:val="22"/>
+        </w:rPr>
+      </w:pPr>
+      <w:r>
+        <w:rPr>
+          <w:rFonts w:ascii="Verdana" w:cs="Verdana" w:eastAsia="Verdana" w:hAnsi="Verdana"/>
+          <w:noProof/>
+          <w:color w:val="111111"/>
+          <w:sz w:val="22"/>
+          <w:szCs w:val="22"/>
+        </w:rPr>
+        <w:t xml:space="preserve">Astro portfolio and Markdown blog platform with typed content, RSS, SEO, code highlighting, and automated deployment.</w:t>
+      </w:r>
+      <w:r>
+        <w:rPr>
+          <w:rFonts w:ascii="Verdana" w:cs="Verdana" w:eastAsia="Verdana" w:hAnsi="Verdana"/>
+          <w:noProof/>
+          <w:color w:val="111111"/>
+          <w:sz w:val="22"/>
+          <w:szCs w:val="22"/>
+        </w:rPr>
+        <w:br/>
+        <w:t xml:space="preserve"/>
+      </w:r>
+      <w:r>
+        <w:rPr>
+          <w:rFonts w:ascii="Verdana" w:cs="Verdana" w:eastAsia="Verdana" w:hAnsi="Verdana"/>
+          <w:noProof/>
+          <w:color w:val="111111"/>
+          <w:sz w:val="22"/>
+          <w:szCs w:val="22"/>
+        </w:rPr>
+        <w:t xml:space="preserve">GitHub: </w:t>
+      </w:r>
+      <w:hyperlink w:history="1" r:id="rIdt2nf6p1mi1dak6wtwme1b">
+        <w:r>
+          <w:rPr>
+            <w:rFonts w:ascii="Verdana" w:cs="Verdana" w:eastAsia="Verdana" w:hAnsi="Verdana"/>
+            <w:noProof/>
+            <w:color w:val="111111"/>
+            <w:sz w:val="22"/>
+            <w:szCs w:val="22"/>
+            <w:u w:val="single" w:color="111111"/>
+          </w:rPr>
+          <w:t xml:space="preserve">alibayramli/me</w:t>
         </w:r>
       </w:hyperlink>
     </w:p>

</xml_diff>

<commit_message>
chore: refresh portfolio project summary
</commit_message>
<xml_diff>
--- a/public/resume/Ali_Bayramli_Resume.docx
+++ b/public/resume/Ali_Bayramli_Resume.docx
@@ -158,7 +158,7 @@
               </w:rPr>
               <w:t xml:space="preserve"> </w:t>
             </w:r>
-            <w:hyperlink w:history="1" r:id="rIdxgdgizqap6iblxkm6mqaj">
+            <w:hyperlink w:history="1" r:id="rIdxvayxipa0i_y4bxwer57n">
               <w:r>
                 <w:rPr>
                   <w:rFonts w:ascii="Verdana" w:cs="Verdana" w:eastAsia="Verdana" w:hAnsi="Verdana"/>
@@ -221,7 +221,7 @@
               </w:rPr>
               <w:t xml:space="preserve"> </w:t>
             </w:r>
-            <w:hyperlink w:history="1" r:id="rIdbtiue0r_jo1ovtctvqgrh">
+            <w:hyperlink w:history="1" r:id="rId4st-t-njavtljmsgtsymy">
               <w:r>
                 <w:rPr>
                   <w:rFonts w:ascii="Verdana" w:cs="Verdana" w:eastAsia="Verdana" w:hAnsi="Verdana"/>
@@ -266,7 +266,7 @@
                 <w:szCs w:val="22"/>
               </w:rPr>
             </w:pPr>
-            <w:hyperlink w:history="1" r:id="rIdlkowbiiczdkvspspwcmop">
+            <w:hyperlink w:history="1" r:id="rId2bt7otrz5wvnmym2utlu2">
               <w:r>
                 <w:rPr>
                   <w:rFonts w:ascii="Verdana" w:cs="Verdana" w:eastAsia="Verdana" w:hAnsi="Verdana"/>
@@ -309,7 +309,7 @@
                 <w:szCs w:val="22"/>
               </w:rPr>
             </w:pPr>
-            <w:hyperlink w:history="1" r:id="rId3wxrixdlhozttaxak0w9y">
+            <w:hyperlink w:history="1" r:id="rIdl_q0qyo5bpwjol7o8pbud">
               <w:r>
                 <w:rPr>
                   <w:rFonts w:ascii="Verdana" w:cs="Verdana" w:eastAsia="Verdana" w:hAnsi="Verdana"/>
@@ -352,7 +352,7 @@
                 <w:szCs w:val="22"/>
               </w:rPr>
             </w:pPr>
-            <w:hyperlink w:history="1" r:id="rIdhh7xn8wcuoux8mtqxm9zo">
+            <w:hyperlink w:history="1" r:id="rIdn2-qkorqud6ygwvz9sg9h">
               <w:r>
                 <w:rPr>
                   <w:rFonts w:ascii="Verdana" w:cs="Verdana" w:eastAsia="Verdana" w:hAnsi="Verdana"/>
@@ -986,7 +986,7 @@
         </w:rPr>
         <w:t xml:space="preserve">GitHub: </w:t>
       </w:r>
-      <w:hyperlink w:history="1" r:id="rIdvcor7sbcldk6k9ibw736p">
+      <w:hyperlink w:history="1" r:id="rIdiv0qh9sbgynzc21rlkil2">
         <w:r>
           <w:rPr>
             <w:rFonts w:ascii="Verdana" w:cs="Verdana" w:eastAsia="Verdana" w:hAnsi="Verdana"/>
@@ -1042,7 +1042,7 @@
           <w:sz w:val="22"/>
           <w:szCs w:val="22"/>
         </w:rPr>
-        <w:t xml:space="preserve">Astro portfolio and Markdown blog platform with typed content, RSS, SEO, code highlighting, and automated deployment.</w:t>
+        <w:t xml:space="preserve">Portfolio and blog showcasing projects, practical experience, challenges solved, impact, and professional growth.</w:t>
       </w:r>
       <w:r>
         <w:rPr>
@@ -1065,7 +1065,7 @@
         </w:rPr>
         <w:t xml:space="preserve">GitHub: </w:t>
       </w:r>
-      <w:hyperlink w:history="1" r:id="rIdt2nf6p1mi1dak6wtwme1b">
+      <w:hyperlink w:history="1" r:id="rIdj1_0aw6_89wrt5rgzbp_t">
         <w:r>
           <w:rPr>
             <w:rFonts w:ascii="Verdana" w:cs="Verdana" w:eastAsia="Verdana" w:hAnsi="Verdana"/>

</xml_diff>

<commit_message>
chore: porfolio UI updates
</commit_message>
<xml_diff>
--- a/public/resume/Ali_Bayramli_Resume.docx
+++ b/public/resume/Ali_Bayramli_Resume.docx
@@ -158,7 +158,7 @@
               </w:rPr>
               <w:t xml:space="preserve"> </w:t>
             </w:r>
-            <w:hyperlink w:history="1" r:id="rIdlajxpd1jbuwuxsqfz9oak">
+            <w:hyperlink w:history="1" r:id="rIdxpy61ndlmu9rypijlnzzo">
               <w:r>
                 <w:rPr>
                   <w:rFonts w:ascii="Verdana" w:cs="Verdana" w:eastAsia="Verdana" w:hAnsi="Verdana"/>
@@ -221,7 +221,7 @@
               </w:rPr>
               <w:t xml:space="preserve"> </w:t>
             </w:r>
-            <w:hyperlink w:history="1" r:id="rIde_dyg8ull1pdv7of2qsuv">
+            <w:hyperlink w:history="1" r:id="rId7dsjublblgn3myor0newm">
               <w:r>
                 <w:rPr>
                   <w:rFonts w:ascii="Verdana" w:cs="Verdana" w:eastAsia="Verdana" w:hAnsi="Verdana"/>
@@ -266,7 +266,7 @@
                 <w:szCs w:val="22"/>
               </w:rPr>
             </w:pPr>
-            <w:hyperlink w:history="1" r:id="rIdhtr2_mtbra0tnuvz8jnic">
+            <w:hyperlink w:history="1" r:id="rIdjocjadllaav6y8khaofil">
               <w:r>
                 <w:rPr>
                   <w:rFonts w:ascii="Verdana" w:cs="Verdana" w:eastAsia="Verdana" w:hAnsi="Verdana"/>
@@ -309,7 +309,7 @@
                 <w:szCs w:val="22"/>
               </w:rPr>
             </w:pPr>
-            <w:hyperlink w:history="1" r:id="rIdmrx1hxei88rz_xyebfvyp">
+            <w:hyperlink w:history="1" r:id="rIdxiopxifpbynj9ftelp4pw">
               <w:r>
                 <w:rPr>
                   <w:rFonts w:ascii="Verdana" w:cs="Verdana" w:eastAsia="Verdana" w:hAnsi="Verdana"/>
@@ -352,7 +352,7 @@
                 <w:szCs w:val="22"/>
               </w:rPr>
             </w:pPr>
-            <w:hyperlink w:history="1" r:id="rIdrk6pqdcgc92nfbjq0ewjx">
+            <w:hyperlink w:history="1" r:id="rIdacwwltpvulj16spmu7gvu">
               <w:r>
                 <w:rPr>
                   <w:rFonts w:ascii="Verdana" w:cs="Verdana" w:eastAsia="Verdana" w:hAnsi="Verdana"/>
@@ -440,7 +440,7 @@
           <w:sz w:val="22"/>
           <w:szCs w:val="22"/>
         </w:rPr>
-        <w:t xml:space="preserve">Frontend: React, Angular, NgRx, RxJS, AG Grid, i18n</w:t>
+        <w:t xml:space="preserve">Frontend: React, Angular, TypeScript</w:t>
       </w:r>
     </w:p>
     <w:p>
@@ -467,7 +467,7 @@
           <w:sz w:val="22"/>
           <w:szCs w:val="22"/>
         </w:rPr>
-        <w:t xml:space="preserve">Backend &amp; Data: Node.js, Python, Express, PostgreSQL, MongoDB, REST APIs</w:t>
+        <w:t xml:space="preserve">Backend and APIs: Node.js, Python, PostgreSQL, REST APIs, AI SDKs</w:t>
       </w:r>
     </w:p>
     <w:p>
@@ -494,79 +494,7 @@
           <w:sz w:val="22"/>
           <w:szCs w:val="22"/>
         </w:rPr>
-        <w:t xml:space="preserve">Delivery &amp; Platforms: Backstage.io, AWS, Terraform, Docker, Kubernetes, GitLab CI/CD</w:t>
-      </w:r>
-    </w:p>
-    <w:p>
-      <w:pPr>
-        <w:keepNext/>
-        <w:spacing w:after="50" w:before="190" w:line="220"/>
-        <w:rPr>
-          <w:rFonts w:ascii="Verdana" w:cs="Verdana" w:eastAsia="Verdana" w:hAnsi="Verdana"/>
-          <w:color w:val="111111"/>
-          <w:sz w:val="22"/>
-          <w:szCs w:val="22"/>
-        </w:rPr>
-      </w:pPr>
-      <w:r>
-        <w:rPr>
-          <w:rFonts w:ascii="Verdana" w:cs="Verdana" w:eastAsia="Verdana" w:hAnsi="Verdana"/>
-          <w:b/>
-          <w:bCs/>
-          <w:caps/>
-          <w:noProof/>
-          <w:color w:val="111111"/>
-          <w:spacing w:val="6"/>
-          <w:sz w:val="26"/>
-          <w:szCs w:val="26"/>
-        </w:rPr>
-        <w:t xml:space="preserve">WORK EXPERIENCE</w:t>
-      </w:r>
-    </w:p>
-    <w:p>
-      <w:pPr>
-        <w:keepNext/>
-        <w:spacing w:after="20" w:line="220"/>
-        <w:rPr>
-          <w:rFonts w:ascii="Verdana" w:cs="Verdana" w:eastAsia="Verdana" w:hAnsi="Verdana"/>
-          <w:color w:val="111111"/>
-          <w:sz w:val="22"/>
-          <w:szCs w:val="22"/>
-        </w:rPr>
-      </w:pPr>
-      <w:r>
-        <w:rPr>
-          <w:rFonts w:ascii="Verdana" w:cs="Verdana" w:eastAsia="Verdana" w:hAnsi="Verdana"/>
-          <w:b/>
-          <w:bCs/>
-          <w:noProof/>
-          <w:color w:val="111111"/>
-          <w:sz w:val="24"/>
-          <w:szCs w:val="24"/>
-        </w:rPr>
-        <w:t xml:space="preserve">XM.com</w:t>
-      </w:r>
-    </w:p>
-    <w:p>
-      <w:pPr>
-        <w:keepNext/>
-        <w:spacing w:after="10" w:line="220"/>
-        <w:rPr>
-          <w:rFonts w:ascii="Verdana" w:cs="Verdana" w:eastAsia="Verdana" w:hAnsi="Verdana"/>
-          <w:color w:val="111111"/>
-          <w:sz w:val="24"/>
-          <w:szCs w:val="24"/>
-        </w:rPr>
-      </w:pPr>
-      <w:r>
-        <w:rPr>
-          <w:rFonts w:ascii="Verdana" w:cs="Verdana" w:eastAsia="Verdana" w:hAnsi="Verdana"/>
-          <w:noProof/>
-          <w:color w:val="111111"/>
-          <w:sz w:val="22"/>
-          <w:szCs w:val="22"/>
-        </w:rPr>
-        <w:t xml:space="preserve">Senior Full-Stack Developer (Oct 2023 - Present)</w:t>
+        <w:t xml:space="preserve">Platform Engineering: Backstage.io, Developer Portals, Service Catalogs, Golden Paths</w:t>
       </w:r>
     </w:p>
     <w:p>
@@ -593,7 +521,79 @@
           <w:sz w:val="22"/>
           <w:szCs w:val="22"/>
         </w:rPr>
-        <w:t xml:space="preserve">Own and maintain software templates for the internal Backstage.io developer platform, saving ~3,000 engineering hours monthly by automating provisioning, configuration, and permissions.</w:t>
+        <w:t xml:space="preserve">Cloud and Delivery: AWS, Terraform, Kubernetes, GitLab CI/CD</w:t>
+      </w:r>
+    </w:p>
+    <w:p>
+      <w:pPr>
+        <w:keepNext/>
+        <w:spacing w:after="50" w:before="190" w:line="220"/>
+        <w:rPr>
+          <w:rFonts w:ascii="Verdana" w:cs="Verdana" w:eastAsia="Verdana" w:hAnsi="Verdana"/>
+          <w:color w:val="111111"/>
+          <w:sz w:val="22"/>
+          <w:szCs w:val="22"/>
+        </w:rPr>
+      </w:pPr>
+      <w:r>
+        <w:rPr>
+          <w:rFonts w:ascii="Verdana" w:cs="Verdana" w:eastAsia="Verdana" w:hAnsi="Verdana"/>
+          <w:b/>
+          <w:bCs/>
+          <w:caps/>
+          <w:noProof/>
+          <w:color w:val="111111"/>
+          <w:spacing w:val="6"/>
+          <w:sz w:val="26"/>
+          <w:szCs w:val="26"/>
+        </w:rPr>
+        <w:t xml:space="preserve">WORK EXPERIENCE</w:t>
+      </w:r>
+    </w:p>
+    <w:p>
+      <w:pPr>
+        <w:keepNext/>
+        <w:spacing w:after="20" w:line="220"/>
+        <w:rPr>
+          <w:rFonts w:ascii="Verdana" w:cs="Verdana" w:eastAsia="Verdana" w:hAnsi="Verdana"/>
+          <w:color w:val="111111"/>
+          <w:sz w:val="22"/>
+          <w:szCs w:val="22"/>
+        </w:rPr>
+      </w:pPr>
+      <w:r>
+        <w:rPr>
+          <w:rFonts w:ascii="Verdana" w:cs="Verdana" w:eastAsia="Verdana" w:hAnsi="Verdana"/>
+          <w:b/>
+          <w:bCs/>
+          <w:noProof/>
+          <w:color w:val="111111"/>
+          <w:sz w:val="24"/>
+          <w:szCs w:val="24"/>
+        </w:rPr>
+        <w:t xml:space="preserve">XM.com</w:t>
+      </w:r>
+    </w:p>
+    <w:p>
+      <w:pPr>
+        <w:keepNext/>
+        <w:spacing w:after="10" w:line="220"/>
+        <w:rPr>
+          <w:rFonts w:ascii="Verdana" w:cs="Verdana" w:eastAsia="Verdana" w:hAnsi="Verdana"/>
+          <w:color w:val="111111"/>
+          <w:sz w:val="24"/>
+          <w:szCs w:val="24"/>
+        </w:rPr>
+      </w:pPr>
+      <w:r>
+        <w:rPr>
+          <w:rFonts w:ascii="Verdana" w:cs="Verdana" w:eastAsia="Verdana" w:hAnsi="Verdana"/>
+          <w:noProof/>
+          <w:color w:val="111111"/>
+          <w:sz w:val="22"/>
+          <w:szCs w:val="22"/>
+        </w:rPr>
+        <w:t xml:space="preserve">Senior Full-Stack Developer (Oct 2023 - Present)</w:t>
       </w:r>
     </w:p>
     <w:p>
@@ -620,7 +620,7 @@
           <w:sz w:val="22"/>
           <w:szCs w:val="22"/>
         </w:rPr>
-        <w:t xml:space="preserve">Lead golden paths, scorecards, and catalog workflows for a Backstage.io IDP within an engineering organization of 1,000+ developers.</w:t>
+        <w:t xml:space="preserve">Own and maintain software templates for the internal Backstage.io developer platform, saving ~3,000 engineering hours monthly by automating provisioning, configuration, and permissions.</w:t>
       </w:r>
     </w:p>
     <w:p>
@@ -647,86 +647,7 @@
           <w:sz w:val="22"/>
           <w:szCs w:val="22"/>
         </w:rPr>
-        <w:t xml:space="preserve">Deliver custom plugins and Azure AI-assisted catalog validation, improving service metadata quality, discoverability, and developer self-service.</w:t>
-      </w:r>
-    </w:p>
-    <w:p>
-      <w:pPr>
-        <w:spacing w:after="125" w:before="12" w:line="220"/>
-        <w:rPr>
-          <w:rFonts w:ascii="Verdana" w:cs="Verdana" w:eastAsia="Verdana" w:hAnsi="Verdana"/>
-          <w:color w:val="111111"/>
-          <w:sz w:val="22"/>
-          <w:szCs w:val="22"/>
-        </w:rPr>
-      </w:pPr>
-      <w:r>
-        <w:rPr>
-          <w:rFonts w:ascii="Verdana" w:cs="Verdana" w:eastAsia="Verdana" w:hAnsi="Verdana"/>
-          <w:b/>
-          <w:bCs/>
-          <w:noProof/>
-          <w:color w:val="111111"/>
-          <w:sz w:val="22"/>
-          <w:szCs w:val="22"/>
-        </w:rPr>
-        <w:t xml:space="preserve">Technologies:</w:t>
-      </w:r>
-      <w:r>
-        <w:rPr>
-          <w:rFonts w:ascii="Verdana" w:cs="Verdana" w:eastAsia="Verdana" w:hAnsi="Verdana"/>
-          <w:noProof/>
-          <w:color w:val="111111"/>
-          <w:sz w:val="22"/>
-          <w:szCs w:val="22"/>
-        </w:rPr>
-        <w:t xml:space="preserve"> React, Node.js, PostgreSQL, Backstage.io, Azure AI, GitLab CI/CD, Terraform, AWS</w:t>
-      </w:r>
-    </w:p>
-    <w:p>
-      <w:pPr>
-        <w:keepNext/>
-        <w:spacing w:after="20" w:line="220"/>
-        <w:rPr>
-          <w:rFonts w:ascii="Verdana" w:cs="Verdana" w:eastAsia="Verdana" w:hAnsi="Verdana"/>
-          <w:color w:val="111111"/>
-          <w:sz w:val="22"/>
-          <w:szCs w:val="22"/>
-        </w:rPr>
-      </w:pPr>
-      <w:r>
-        <w:rPr>
-          <w:rFonts w:ascii="Verdana" w:cs="Verdana" w:eastAsia="Verdana" w:hAnsi="Verdana"/>
-          <w:b/>
-          <w:bCs/>
-          <w:noProof/>
-          <w:color w:val="111111"/>
-          <w:sz w:val="24"/>
-          <w:szCs w:val="24"/>
-        </w:rPr>
-        <w:t xml:space="preserve">Morgan Stanley</w:t>
-      </w:r>
-    </w:p>
-    <w:p>
-      <w:pPr>
-        <w:keepNext/>
-        <w:spacing w:after="10" w:line="220"/>
-        <w:rPr>
-          <w:rFonts w:ascii="Verdana" w:cs="Verdana" w:eastAsia="Verdana" w:hAnsi="Verdana"/>
-          <w:color w:val="111111"/>
-          <w:sz w:val="24"/>
-          <w:szCs w:val="24"/>
-        </w:rPr>
-      </w:pPr>
-      <w:r>
-        <w:rPr>
-          <w:rFonts w:ascii="Verdana" w:cs="Verdana" w:eastAsia="Verdana" w:hAnsi="Verdana"/>
-          <w:noProof/>
-          <w:color w:val="111111"/>
-          <w:sz w:val="22"/>
-          <w:szCs w:val="22"/>
-        </w:rPr>
-        <w:t xml:space="preserve">Front-End Developer (Sep 2021 - Sep 2023)</w:t>
+        <w:t xml:space="preserve">Lead golden paths, scorecards, and catalog workflows for a Backstage.io IDP within an engineering organization of 1,000+ developers.</w:t>
       </w:r>
     </w:p>
     <w:p>
@@ -753,7 +674,7 @@
           <w:sz w:val="22"/>
           <w:szCs w:val="22"/>
         </w:rPr>
-        <w:t xml:space="preserve">Migrated ~15 legacy desktop applications to internally maintained Angular web UIs, giving brokers browser-based access and eliminating per-desktop deployment and update work.</w:t>
+        <w:t xml:space="preserve">Build custom Backstage plugins with the Azure AI SDK to validate catalog metadata.</w:t>
       </w:r>
     </w:p>
     <w:p>
@@ -786,7 +707,7 @@
           <w:sz w:val="22"/>
           <w:szCs w:val="22"/>
         </w:rPr>
-        <w:t xml:space="preserve"> Angular, AG Grid, RxJS, Jest, Jenkins, SCSS</w:t>
+        <w:t xml:space="preserve"> Backstage.io, TypeScript, React, Node.js, PostgreSQL, Azure AI SDK, AWS, EKS, Helm, Terraform, GitLab CI/CD</w:t>
       </w:r>
     </w:p>
     <w:p>
@@ -810,7 +731,7 @@
           <w:sz w:val="24"/>
           <w:szCs w:val="24"/>
         </w:rPr>
-        <w:t xml:space="preserve">ExxonMobil</w:t>
+        <w:t xml:space="preserve">Morgan Stanley</w:t>
       </w:r>
     </w:p>
     <w:p>
@@ -832,7 +753,7 @@
           <w:sz w:val="22"/>
           <w:szCs w:val="22"/>
         </w:rPr>
-        <w:t xml:space="preserve">Full-Stack Developer (May 2018 - Aug 2021)</w:t>
+        <w:t xml:space="preserve">Front-End Developer (Sep 2021 - Sep 2023)</w:t>
       </w:r>
     </w:p>
     <w:p>
@@ -859,6 +780,112 @@
           <w:sz w:val="22"/>
           <w:szCs w:val="22"/>
         </w:rPr>
+        <w:t xml:space="preserve">Migrated ~15 legacy desktop applications to internally maintained Angular web UIs, giving brokers browser-based access and eliminating per-desktop deployment and update work.</w:t>
+      </w:r>
+    </w:p>
+    <w:p>
+      <w:pPr>
+        <w:spacing w:after="125" w:before="12" w:line="220"/>
+        <w:rPr>
+          <w:rFonts w:ascii="Verdana" w:cs="Verdana" w:eastAsia="Verdana" w:hAnsi="Verdana"/>
+          <w:color w:val="111111"/>
+          <w:sz w:val="22"/>
+          <w:szCs w:val="22"/>
+        </w:rPr>
+      </w:pPr>
+      <w:r>
+        <w:rPr>
+          <w:rFonts w:ascii="Verdana" w:cs="Verdana" w:eastAsia="Verdana" w:hAnsi="Verdana"/>
+          <w:b/>
+          <w:bCs/>
+          <w:noProof/>
+          <w:color w:val="111111"/>
+          <w:sz w:val="22"/>
+          <w:szCs w:val="22"/>
+        </w:rPr>
+        <w:t xml:space="preserve">Technologies:</w:t>
+      </w:r>
+      <w:r>
+        <w:rPr>
+          <w:rFonts w:ascii="Verdana" w:cs="Verdana" w:eastAsia="Verdana" w:hAnsi="Verdana"/>
+          <w:noProof/>
+          <w:color w:val="111111"/>
+          <w:sz w:val="22"/>
+          <w:szCs w:val="22"/>
+        </w:rPr>
+        <w:t xml:space="preserve"> Angular, AG Grid, RxJS, Jest, Jenkins, SCSS</w:t>
+      </w:r>
+    </w:p>
+    <w:p>
+      <w:pPr>
+        <w:keepNext/>
+        <w:spacing w:after="20" w:line="220"/>
+        <w:rPr>
+          <w:rFonts w:ascii="Verdana" w:cs="Verdana" w:eastAsia="Verdana" w:hAnsi="Verdana"/>
+          <w:color w:val="111111"/>
+          <w:sz w:val="22"/>
+          <w:szCs w:val="22"/>
+        </w:rPr>
+      </w:pPr>
+      <w:r>
+        <w:rPr>
+          <w:rFonts w:ascii="Verdana" w:cs="Verdana" w:eastAsia="Verdana" w:hAnsi="Verdana"/>
+          <w:b/>
+          <w:bCs/>
+          <w:noProof/>
+          <w:color w:val="111111"/>
+          <w:sz w:val="24"/>
+          <w:szCs w:val="24"/>
+        </w:rPr>
+        <w:t xml:space="preserve">ExxonMobil</w:t>
+      </w:r>
+    </w:p>
+    <w:p>
+      <w:pPr>
+        <w:keepNext/>
+        <w:spacing w:after="10" w:line="220"/>
+        <w:rPr>
+          <w:rFonts w:ascii="Verdana" w:cs="Verdana" w:eastAsia="Verdana" w:hAnsi="Verdana"/>
+          <w:color w:val="111111"/>
+          <w:sz w:val="24"/>
+          <w:szCs w:val="24"/>
+        </w:rPr>
+      </w:pPr>
+      <w:r>
+        <w:rPr>
+          <w:rFonts w:ascii="Verdana" w:cs="Verdana" w:eastAsia="Verdana" w:hAnsi="Verdana"/>
+          <w:noProof/>
+          <w:color w:val="111111"/>
+          <w:sz w:val="22"/>
+          <w:szCs w:val="22"/>
+        </w:rPr>
+        <w:t xml:space="preserve">Full-Stack Developer (May 2018 - Aug 2021)</w:t>
+      </w:r>
+    </w:p>
+    <w:p>
+      <w:pPr>
+        <w:pStyle w:val="ListParagraph"/>
+        <w:numPr>
+          <w:ilvl w:val="0"/>
+          <w:numId w:val="1"/>
+        </w:numPr>
+        <w:spacing w:after="4" w:before="4" w:line="220"/>
+        <w:ind w:left="900" w:hanging="260"/>
+        <w:rPr>
+          <w:rFonts w:ascii="Verdana" w:cs="Verdana" w:eastAsia="Verdana" w:hAnsi="Verdana"/>
+          <w:color w:val="111111"/>
+          <w:sz w:val="22"/>
+          <w:szCs w:val="22"/>
+        </w:rPr>
+      </w:pPr>
+      <w:r>
+        <w:rPr>
+          <w:rFonts w:ascii="Verdana" w:cs="Verdana" w:eastAsia="Verdana" w:hAnsi="Verdana"/>
+          <w:noProof/>
+          <w:color w:val="111111"/>
+          <w:sz w:val="22"/>
+          <w:szCs w:val="22"/>
+        </w:rPr>
         <w:t xml:space="preserve">Avoided ~$100,000 annually in third-party tooling costs by moving email generation and styling to an internally maintained platform.</w:t>
       </w:r>
     </w:p>
@@ -986,7 +1013,7 @@
         </w:rPr>
         <w:t xml:space="preserve">GitHub: </w:t>
       </w:r>
-      <w:hyperlink w:history="1" r:id="rIdxtqh0douxervzq-jfyel2">
+      <w:hyperlink w:history="1" r:id="rId0jy9w-q5t194bpgezage_">
         <w:r>
           <w:rPr>
             <w:rFonts w:ascii="Verdana" w:cs="Verdana" w:eastAsia="Verdana" w:hAnsi="Verdana"/>
@@ -1065,7 +1092,7 @@
         </w:rPr>
         <w:t xml:space="preserve">GitHub: </w:t>
       </w:r>
-      <w:hyperlink w:history="1" r:id="rIdyq-bpw61wdmaulzntucw2">
+      <w:hyperlink w:history="1" r:id="rId29puc0ofq9hlznyhmet1s">
         <w:r>
           <w:rPr>
             <w:rFonts w:ascii="Verdana" w:cs="Verdana" w:eastAsia="Verdana" w:hAnsi="Verdana"/>

</xml_diff>